<commit_message>
docs: expand technical report with Q&A and frontend-to-backend data map
</commit_message>
<xml_diff>
--- a/document/Scoring_and_Louvain_Explainer.docx
+++ b/document/Scoring_and_Louvain_Explainer.docx
@@ -876,6 +876,276 @@
         <w:t>The 7 legitimate companies sharing a common office address were successfully scored as low-risk (ranking #6) and segregated from the active fraud syndicates.</w:t>
       </w:r>
     </w:p>
+    <w:p>
+      <w:pPr>
+        <w:keepNext/>
+        <w:spacing w:before="240" w:after="120"/>
+      </w:pPr>
+      <w:r>
+        <w:rPr>
+          <w:rFonts w:ascii="Arial" w:hAnsi="Arial"/>
+          <w:b/>
+          <w:color w:val="0F172A"/>
+          <w:sz w:val="36"/>
+        </w:rPr>
+        <w:t>5. Frontend-to-Backend Data Integration Map</w:t>
+      </w:r>
+    </w:p>
+    <w:p>
+      <w:pPr>
+        <w:spacing w:after="120" w:line="276" w:lineRule="auto"/>
+      </w:pPr>
+      <w:r>
+        <w:rPr>
+          <w:rFonts w:ascii="Arial" w:hAnsi="Arial"/>
+          <w:color w:val="334155"/>
+          <w:sz w:val="21"/>
+        </w:rPr>
+        <w:t>For the presentation panel, understanding how the user interface maps to the underlying FastAPI endpoints and database structures is critical. Below is the mapping of all frontend components to their respective backend services:</w:t>
+      </w:r>
+    </w:p>
+    <w:p>
+      <w:pPr>
+        <w:pStyle w:val="ListBullet"/>
+        <w:spacing w:after="80" w:line="276" w:lineRule="auto"/>
+      </w:pPr>
+      <w:r>
+        <w:rPr>
+          <w:rFonts w:ascii="Arial" w:hAnsi="Arial"/>
+          <w:b/>
+          <w:color w:val="0F172A"/>
+          <w:sz w:val="21"/>
+        </w:rPr>
+        <w:t xml:space="preserve">Dashboard Summary Cards: </w:t>
+      </w:r>
+      <w:r>
+        <w:rPr>
+          <w:rFonts w:ascii="Arial" w:hAnsi="Arial"/>
+          <w:color w:val="334155"/>
+          <w:sz w:val="21"/>
+        </w:rPr>
+        <w:t>Mapped to '/api/dashboard/summary'. Displays total metrics such as the 1,007 loaded companies, 2,313 director edges, and active investigations. Under the hood, this performs quick SQL aggregate queries (`SELECT count(*) FROM companies`).</w:t>
+      </w:r>
+    </w:p>
+    <w:p>
+      <w:pPr>
+        <w:pStyle w:val="ListBullet"/>
+        <w:spacing w:after="80" w:line="276" w:lineRule="auto"/>
+      </w:pPr>
+      <w:r>
+        <w:rPr>
+          <w:rFonts w:ascii="Arial" w:hAnsi="Arial"/>
+          <w:b/>
+          <w:color w:val="0F172A"/>
+          <w:sz w:val="21"/>
+        </w:rPr>
+        <w:t xml:space="preserve">Cluster Risk Modularity Donut Chart: </w:t>
+      </w:r>
+      <w:r>
+        <w:rPr>
+          <w:rFonts w:ascii="Arial" w:hAnsi="Arial"/>
+          <w:color w:val="334155"/>
+          <w:sz w:val="21"/>
+        </w:rPr>
+        <w:t>Mapped to '/api/clusters'. It aggregates communities identified by the Louvain clustering and groups them into high risk (composite &gt;= 75), medium risk (30-74), and low risk (&lt;30).</w:t>
+      </w:r>
+    </w:p>
+    <w:p>
+      <w:pPr>
+        <w:pStyle w:val="ListBullet"/>
+        <w:spacing w:after="80" w:line="276" w:lineRule="auto"/>
+      </w:pPr>
+      <w:r>
+        <w:rPr>
+          <w:rFonts w:ascii="Arial" w:hAnsi="Arial"/>
+          <w:b/>
+          <w:color w:val="0F172A"/>
+          <w:sz w:val="21"/>
+        </w:rPr>
+        <w:t xml:space="preserve">Risk Rankings Table: </w:t>
+      </w:r>
+      <w:r>
+        <w:rPr>
+          <w:rFonts w:ascii="Arial" w:hAnsi="Arial"/>
+          <w:color w:val="334155"/>
+          <w:sz w:val="21"/>
+        </w:rPr>
+        <w:t>Mapped to the dynamic list of high-risk clusters returned by '/api/clusters' sorted by `cluster_risk_score` in descending order. Selecting a row pulls detailed community info via `/api/clusters/{id}`.</w:t>
+      </w:r>
+    </w:p>
+    <w:p>
+      <w:pPr>
+        <w:pStyle w:val="ListBullet"/>
+        <w:spacing w:after="80" w:line="276" w:lineRule="auto"/>
+      </w:pPr>
+      <w:r>
+        <w:rPr>
+          <w:rFonts w:ascii="Arial" w:hAnsi="Arial"/>
+          <w:b/>
+          <w:color w:val="0F172A"/>
+          <w:sz w:val="21"/>
+        </w:rPr>
+        <w:t xml:space="preserve">Interactive Cytoscape workspace: </w:t>
+      </w:r>
+      <w:r>
+        <w:rPr>
+          <w:rFonts w:ascii="Arial" w:hAnsi="Arial"/>
+          <w:color w:val="334155"/>
+          <w:sz w:val="21"/>
+        </w:rPr>
+        <w:t>Mapped to `/api/clusters/{id}/graph` which generates the JSON formatted graph structure (nodes and edges) containing companies, directors, and lenders in that specific community. By requesting subgraphs dynamically, the frontend stays responsive instead of trying to render all 3,789 nodes.</w:t>
+      </w:r>
+    </w:p>
+    <w:p>
+      <w:pPr>
+        <w:pStyle w:val="ListBullet"/>
+        <w:spacing w:after="80" w:line="276" w:lineRule="auto"/>
+      </w:pPr>
+      <w:r>
+        <w:rPr>
+          <w:rFonts w:ascii="Arial" w:hAnsi="Arial"/>
+          <w:b/>
+          <w:color w:val="0F172A"/>
+          <w:sz w:val="21"/>
+        </w:rPr>
+        <w:t xml:space="preserve">Global Network Visualization (Pyvis): </w:t>
+      </w:r>
+      <w:r>
+        <w:rPr>
+          <w:rFonts w:ascii="Arial" w:hAnsi="Arial"/>
+          <w:color w:val="334155"/>
+          <w:sz w:val="21"/>
+        </w:rPr>
+        <w:t>Mapped to `/backend/static/pyvis_graph.html`, pre-rendered by `scripts/build_pyvis_graph.py` to show the global cluster visualization using a physics-driven layout in a static iframe.</w:t>
+      </w:r>
+    </w:p>
+    <w:p>
+      <w:pPr>
+        <w:keepNext/>
+        <w:spacing w:before="240" w:after="120"/>
+      </w:pPr>
+      <w:r>
+        <w:rPr>
+          <w:rFonts w:ascii="Arial" w:hAnsi="Arial"/>
+          <w:b/>
+          <w:color w:val="0F172A"/>
+          <w:sz w:val="36"/>
+        </w:rPr>
+        <w:t>6. Technical Q&amp;A &amp; Defense Sheet (Jury Q&amp;A)</w:t>
+      </w:r>
+    </w:p>
+    <w:p>
+      <w:pPr>
+        <w:keepNext/>
+        <w:spacing w:before="240" w:after="120"/>
+      </w:pPr>
+      <w:r>
+        <w:rPr>
+          <w:rFonts w:ascii="Arial" w:hAnsi="Arial"/>
+          <w:b/>
+          <w:color w:val="475569"/>
+          <w:sz w:val="24"/>
+        </w:rPr>
+        <w:t>Q1: How does the model distinguish between a genuine CA firm hosting 100+ clients and an actual shell company address hub?</w:t>
+      </w:r>
+    </w:p>
+    <w:p>
+      <w:pPr>
+        <w:spacing w:after="120" w:line="276" w:lineRule="auto"/>
+      </w:pPr>
+      <w:r>
+        <w:rPr>
+          <w:rFonts w:ascii="Arial" w:hAnsi="Arial"/>
+          <w:color w:val="334155"/>
+          <w:sz w:val="21"/>
+        </w:rPr>
+        <w:t>A: The scoring engine uses a weighted composite average. While both will have a high Address Centrality Risk (S_addr = 100), a genuine CA firm's hosted companies will have clean profiles: their directors won't board multiple other clients (Director Degree = 0), incorporations will be staggered over years (Burst Risk = 0), they will have active MCA filings (Filing Risk = 0), and they won't share loan charge patterns or defaults (Lender/Defaulter Risk = 0). As a result, the CA firm's clients will score only around 25/100, while the shell ring companies will score &gt;= 75/100.</w:t>
+      </w:r>
+    </w:p>
+    <w:p>
+      <w:pPr>
+        <w:keepNext/>
+        <w:spacing w:before="240" w:after="120"/>
+      </w:pPr>
+      <w:r>
+        <w:rPr>
+          <w:rFonts w:ascii="Arial" w:hAnsi="Arial"/>
+          <w:b/>
+          <w:color w:val="475569"/>
+          <w:sz w:val="24"/>
+        </w:rPr>
+        <w:t>Q2: How does the system scale to handle millions of companies registered under the MCA registry?</w:t>
+      </w:r>
+    </w:p>
+    <w:p>
+      <w:pPr>
+        <w:spacing w:after="120" w:line="276" w:lineRule="auto"/>
+      </w:pPr>
+      <w:r>
+        <w:rPr>
+          <w:rFonts w:ascii="Arial" w:hAnsi="Arial"/>
+          <w:color w:val="334155"/>
+          <w:sz w:val="21"/>
+        </w:rPr>
+        <w:t>A: The system uses a frozen-baseline architecture. Z-score parameters are computed once on normal background data. When new companies are added, their risk scores are calculated in O(1) time by comparing their raw metrics directly against these frozen parameters, rather than recalculating the entire graph statistics. Community detection (Louvain) is run as an asynchronous batch job (e.g. nightly) to update cluster divisions, ensuring no real-time performance bottleneck on the API server.</w:t>
+      </w:r>
+    </w:p>
+    <w:p>
+      <w:pPr>
+        <w:keepNext/>
+        <w:spacing w:before="240" w:after="120"/>
+      </w:pPr>
+      <w:r>
+        <w:rPr>
+          <w:rFonts w:ascii="Arial" w:hAnsi="Arial"/>
+          <w:b/>
+          <w:color w:val="475569"/>
+          <w:sz w:val="24"/>
+        </w:rPr>
+        <w:t>Q3: What database schema supports these network connections?</w:t>
+      </w:r>
+    </w:p>
+    <w:p>
+      <w:pPr>
+        <w:spacing w:after="120" w:line="276" w:lineRule="auto"/>
+      </w:pPr>
+      <w:r>
+        <w:rPr>
+          <w:rFonts w:ascii="Arial" w:hAnsi="Arial"/>
+          <w:color w:val="334155"/>
+          <w:sz w:val="21"/>
+        </w:rPr>
+        <w:t>A: The backend uses a relational SQLite database (SQLAlchemy ORM) containing six key tables: (1) 'companies' storing CIN, paid-up capital, and MCA status; (2) 'directors' storing DIN and name; (3) 'company_directors' linking directors to companies; (4) 'addresses' mapping registration coordinates; (5) 'loans' tracking active CERSAI borrowing registrations; and (6) 'defaulters' tracking RBI wilful default records.</w:t>
+      </w:r>
+    </w:p>
+    <w:p>
+      <w:pPr>
+        <w:keepNext/>
+        <w:spacing w:before="240" w:after="120"/>
+      </w:pPr>
+      <w:r>
+        <w:rPr>
+          <w:rFonts w:ascii="Arial" w:hAnsi="Arial"/>
+          <w:b/>
+          <w:color w:val="475569"/>
+          <w:sz w:val="24"/>
+        </w:rPr>
+        <w:t>Q4: Why was the Louvain algorithm chosen over other community algorithms like K-Means or Infomap?</w:t>
+      </w:r>
+    </w:p>
+    <w:p>
+      <w:pPr>
+        <w:spacing w:after="120" w:line="276" w:lineRule="auto"/>
+      </w:pPr>
+      <w:r>
+        <w:rPr>
+          <w:rFonts w:ascii="Arial" w:hAnsi="Arial"/>
+          <w:color w:val="334155"/>
+          <w:sz w:val="21"/>
+        </w:rPr>
+        <w:t>A: K-Means is a distance-based clustering algorithm requiring a vector space, which is not suitable for complex graph topologies with multiple relationship types (directors, addresses, lenders). Louvain is specifically designed for complex network graphs. It optimizes Modularity directly, which is ideal for finding cohesive communities where the number of clusters is unknown beforehand. Infomap relies on flow dynamics (random walks), which is less effective than Modularity when identifying resource-sharing groups like shell rings.</w:t>
+      </w:r>
+    </w:p>
     <w:sectPr>
       <w:pgSz w:w="12240" w:h="15840"/>
       <w:pgMar w:top="1440" w:right="1440" w:bottom="1440" w:left="1440" w:header="720" w:footer="720" w:gutter="0"/>

</xml_diff>